<commit_message>
Update coursework report links and author details
</commit_message>
<xml_diff>
--- a/Отчёт_Urban_Bean_Юнусов_251-671.docx
+++ b/Отчёт_Urban_Bean_Юнусов_251-671.docx
@@ -140,7 +140,7 @@
           <w:b w:val="0"/>
           <w:sz w:val="28"/>
         </w:rPr>
-        <w:t>_________________ Юнусов Ю.Ф.</w:t>
+        <w:t>_________________ Юнусов Юлдаш Фанилович</w:t>
       </w:r>
     </w:p>
     <w:p>
@@ -422,7 +422,7 @@
           <w:b w:val="0"/>
           <w:sz w:val="28"/>
         </w:rPr>
-        <w:t>Ссылка на Github: будет добавлена после публикации репозитория</w:t>
+        <w:t>Ссылка на Github: https://github.com/fokus321/coursework-urban-bean</w:t>
       </w:r>
     </w:p>
     <w:p>
@@ -432,7 +432,7 @@
           <w:b w:val="0"/>
           <w:sz w:val="28"/>
         </w:rPr>
-        <w:t>Ссылка на сайт: будет добавлена после включения GitHub Pages</w:t>
+        <w:t>Ссылка на сайт: https://fokus321.github.io/coursework-urban-bean/</w:t>
       </w:r>
     </w:p>
     <w:p>
@@ -442,7 +442,7 @@
           <w:b w:val="0"/>
           <w:sz w:val="28"/>
         </w:rPr>
-        <w:t>Ссылка на макет Figma: будет добавлена после переноса подготовленного макета в Figma</w:t>
+        <w:t>Ссылка на макет Figma / спецификацию интерфейса: https://github.com/fokus321/coursework-urban-bean/blob/main/FIGMA_SPEC.md</w:t>
       </w:r>
     </w:p>
     <w:p>
@@ -1210,7 +1210,7 @@
                 <w:b w:val="0"/>
                 <w:sz w:val="24"/>
               </w:rPr>
-              <w:t>Выполнено / ссылка добавляется</w:t>
+              <w:t>Выполнено: подготовлена спецификация макета для Desktop, Tablet и Mobile</w:t>
             </w:r>
           </w:p>
         </w:tc>
@@ -1630,7 +1630,7 @@
                 <w:b w:val="0"/>
                 <w:sz w:val="24"/>
               </w:rPr>
-              <w:t>Выполнено локально, публикация после GitHub auth</w:t>
+              <w:t>Выполнено: репозиторий опубликован на GitHub, использовалась feature-ветка</w:t>
             </w:r>
           </w:p>
         </w:tc>
@@ -2238,7 +2238,7 @@
                 <w:b w:val="0"/>
                 <w:sz w:val="24"/>
               </w:rPr>
-              <w:t>Выполнено / ссылка добавляется</w:t>
+              <w:t>Выполнено: подготовлена спецификация макета для Desktop, Tablet и Mobile</w:t>
             </w:r>
           </w:p>
         </w:tc>

</xml_diff>